<commit_message>
Update resume and site: Hartford location, Middleware, Math minor
- Remove "sensor fusion" from resume and site skills
- Restore "Middleware" to site robotics skills
- Change location to Hartford, CT on both resume and site
- Keep Mathematics Minor in site education skills

Co-Authored-By: Claude Opus 4.8 <noreply@anthropic.com>
</commit_message>
<xml_diff>
--- a/assets/Jackie_Videira_Resume.docx
+++ b/assets/Jackie_Videira_Resume.docx
@@ -29,7 +29,7 @@
           <w:sz w:val="18"/>
           <w:szCs w:val="18"/>
         </w:rPr>
-        <w:t xml:space="preserve">West Hartford, CT  •  (203) 400-7798  •  jackie.videira@gmail.com  •  </w:t>
+        <w:t xml:space="preserve">Hartford, CT  •  (203) 400-7798  •  jackie.videira@gmail.com  •  </w:t>
       </w:r>
       <w:hyperlink w:history="1" r:id="rIdyl1m3rlxekvtsjyrjfqew">
         <w:r>
@@ -512,7 +512,7 @@
           <w:sz w:val="20"/>
           <w:szCs w:val="20"/>
         </w:rPr>
-        <w:t xml:space="preserve">Discrete-state task planning, real-time motion coordination, gRPC, dual-arm manipulation, sensor fusion, software-hardware integration</w:t>
+        <w:t xml:space="preserve">Discrete-state task planning, real-time motion coordination, gRPC, dual-arm manipulation, software-hardware integration</w:t>
       </w:r>
     </w:p>
     <w:p>

</xml_diff>